<commit_message>
Simplify supervisor feature comparison
</commit_message>
<xml_diff>
--- a/docs/HajjGuard_Project_Features_Summary.docx
+++ b/docs/HajjGuard_Project_Features_Summary.docx
@@ -5,10 +5,9 @@
     <w:p>
       <w:pPr>
         <w:pStyle w:val="Title"/>
-        <w:jc w:val="left"/>
       </w:pPr>
       <w:r>
-        <w:t>HajjGuard Project Features</w:t>
+        <w:t>HajjGuard Features Compared With the Doctor’s Plan</w:t>
       </w:r>
     </w:p>
     <w:p>
@@ -18,15 +17,9 @@
       <w:r>
         <w:rPr>
           <w:i/>
-          <w:color w:val="464646"/>
-          <w:sz w:val="21"/>
+          <w:color w:val="505050"/>
         </w:rPr>
-        <w:t>Simple project summary for the supervisor</w:t>
-      </w:r>
-    </w:p>
-    <w:p>
-      <w:r>
-        <w:t>HajjGuard is one responsive web application for pilgrims and authorized operations staff. It helps pilgrims understand crowd conditions, stay connected to their group, and request help. It helps staff view zones, respond to safety incidents, and review system activity.</w:t>
+        <w:t>Short feature list for the project discussion</w:t>
       </w:r>
     </w:p>
     <w:p>
@@ -34,12 +27,13 @@
         <w:pStyle w:val="Heading1"/>
       </w:pPr>
       <w:r>
-        <w:t>What the doctor’s plan includes</w:t>
+        <w:t>Features from the doctor’s plan</w:t>
       </w:r>
     </w:p>
     <w:p>
       <w:pPr>
-        <w:pStyle w:val="CompactBullet"/>
+        <w:spacing w:after="40"/>
+        <w:ind w:left="259" w:hanging="216"/>
       </w:pPr>
       <w:r>
         <w:rPr>
@@ -48,12 +42,13 @@
         <w:t xml:space="preserve">• </w:t>
       </w:r>
       <w:r>
-        <w:t>Pilgrim registration, login, profile, language, age band, and mobility information.</w:t>
+        <w:t>Registration, login, pilgrim profile, language, age band, and mobility status.</w:t>
       </w:r>
     </w:p>
     <w:p>
       <w:pPr>
-        <w:pStyle w:val="CompactBullet"/>
+        <w:spacing w:after="40"/>
+        <w:ind w:left="259" w:hanging="216"/>
       </w:pPr>
       <w:r>
         <w:rPr>
@@ -62,12 +57,13 @@
         <w:t xml:space="preserve">• </w:t>
       </w:r>
       <w:r>
-        <w:t>Joining a Hajj group with a code and viewing the group members and leader contact.</w:t>
+        <w:t>Join a Hajj group with a code and view the group leader and members.</w:t>
       </w:r>
     </w:p>
     <w:p>
       <w:pPr>
-        <w:pStyle w:val="CompactBullet"/>
+        <w:spacing w:after="40"/>
+        <w:ind w:left="259" w:hanging="216"/>
       </w:pPr>
       <w:r>
         <w:rPr>
@@ -76,12 +72,13 @@
         <w:t xml:space="preserve">• </w:t>
       </w:r>
       <w:r>
-        <w:t>A map with colored zone status: comfortable, busy, or crowded.</w:t>
+        <w:t>Map with colored crowd zones: comfortable, busy, and crowded.</w:t>
       </w:r>
     </w:p>
     <w:p>
       <w:pPr>
-        <w:pStyle w:val="CompactBullet"/>
+        <w:spacing w:after="40"/>
+        <w:ind w:left="259" w:hanging="216"/>
       </w:pPr>
       <w:r>
         <w:rPr>
@@ -90,12 +87,13 @@
         <w:t xml:space="preserve">• </w:t>
       </w:r>
       <w:r>
-        <w:t>Current crowd information and a simple forecast for the next 20 minutes.</w:t>
+        <w:t>Current crowd status, 20-minute crowd forecast, risk score, and route suggestion.</w:t>
       </w:r>
     </w:p>
     <w:p>
       <w:pPr>
-        <w:pStyle w:val="CompactBullet"/>
+        <w:spacing w:after="40"/>
+        <w:ind w:left="259" w:hanging="216"/>
       </w:pPr>
       <w:r>
         <w:rPr>
@@ -104,12 +102,13 @@
         <w:t xml:space="preserve">• </w:t>
       </w:r>
       <w:r>
-        <w:t>A risk score that explains crowd, vulnerability, and heat-related factors.</w:t>
+        <w:t>SOS button with category and location.</w:t>
       </w:r>
     </w:p>
     <w:p>
       <w:pPr>
-        <w:pStyle w:val="CompactBullet"/>
+        <w:spacing w:after="40"/>
+        <w:ind w:left="259" w:hanging="216"/>
       </w:pPr>
       <w:r>
         <w:rPr>
@@ -118,40 +117,13 @@
         <w:t xml:space="preserve">• </w:t>
       </w:r>
       <w:r>
-        <w:t>Routes that can suggest another corridor when a zone is becoming crowded.</w:t>
+        <w:t>QR code for lost-pilgrim recovery.</w:t>
       </w:r>
     </w:p>
     <w:p>
       <w:pPr>
-        <w:pStyle w:val="CompactBullet"/>
-      </w:pPr>
-      <w:r>
-        <w:rPr>
-          <w:b/>
-        </w:rPr>
-        <w:t xml:space="preserve">• </w:t>
-      </w:r>
-      <w:r>
-        <w:t>A large SOS action with category and location information.</w:t>
-      </w:r>
-    </w:p>
-    <w:p>
-      <w:pPr>
-        <w:pStyle w:val="CompactBullet"/>
-      </w:pPr>
-      <w:r>
-        <w:rPr>
-          <w:b/>
-        </w:rPr>
-        <w:t xml:space="preserve">• </w:t>
-      </w:r>
-      <w:r>
-        <w:t>QR-based lost-pilgrim recovery and the group leader contact.</w:t>
-      </w:r>
-    </w:p>
-    <w:p>
-      <w:pPr>
-        <w:pStyle w:val="CompactBullet"/>
+        <w:spacing w:after="40"/>
+        <w:ind w:left="259" w:hanging="216"/>
       </w:pPr>
       <w:r>
         <w:rPr>
@@ -165,7 +137,8 @@
     </w:p>
     <w:p>
       <w:pPr>
-        <w:pStyle w:val="CompactBullet"/>
+        <w:spacing w:after="40"/>
+        <w:ind w:left="259" w:hanging="216"/>
       </w:pPr>
       <w:r>
         <w:rPr>
@@ -174,7 +147,7 @@
         <w:t xml:space="preserve">• </w:t>
       </w:r>
       <w:r>
-        <w:t>Arabic and English responsive screens for phone and laptop use.</w:t>
+        <w:t>Arabic and English responsive web screens.</w:t>
       </w:r>
     </w:p>
     <w:p>
@@ -182,12 +155,13 @@
         <w:pStyle w:val="Heading1"/>
       </w:pPr>
       <w:r>
-        <w:t>Extra features already made in HajjGuard</w:t>
+        <w:t>Extra features HajjGuard will add</w:t>
       </w:r>
     </w:p>
     <w:p>
       <w:pPr>
-        <w:pStyle w:val="CompactBullet"/>
+        <w:spacing w:after="40"/>
+        <w:ind w:left="259" w:hanging="216"/>
       </w:pPr>
       <w:r>
         <w:rPr>
@@ -196,12 +170,13 @@
         <w:t xml:space="preserve">• </w:t>
       </w:r>
       <w:r>
-        <w:t>Real geographic map tiles with roads and places around the Holy Sites; no decorative fake map is used.</w:t>
+        <w:t>Real geographic map with roads and Holy Site locations.</w:t>
       </w:r>
     </w:p>
     <w:p>
       <w:pPr>
-        <w:pStyle w:val="CompactBullet"/>
+        <w:spacing w:after="40"/>
+        <w:ind w:left="259" w:hanging="216"/>
       </w:pPr>
       <w:r>
         <w:rPr>
@@ -210,12 +185,13 @@
         <w:t xml:space="preserve">• </w:t>
       </w:r>
       <w:r>
-        <w:t>Privacy and account protection: authenticated access, safer ownership checks, explicit consent, and protected sensitive actions.</w:t>
+        <w:t>Secure login and privacy controls so users see only their own information.</w:t>
       </w:r>
     </w:p>
     <w:p>
       <w:pPr>
-        <w:pStyle w:val="CompactBullet"/>
+        <w:spacing w:after="40"/>
+        <w:ind w:left="259" w:hanging="216"/>
       </w:pPr>
       <w:r>
         <w:rPr>
@@ -224,12 +200,13 @@
         <w:t xml:space="preserve">• </w:t>
       </w:r>
       <w:r>
-        <w:t>Consent-based location sharing that can be revoked and expires with the pilgrim’s trip.</w:t>
+        <w:t>Explicit consent for location sharing, with revoke and automatic trip expiry.</w:t>
       </w:r>
     </w:p>
     <w:p>
       <w:pPr>
-        <w:pStyle w:val="CompactBullet"/>
+        <w:spacing w:after="40"/>
+        <w:ind w:left="259" w:hanging="216"/>
       </w:pPr>
       <w:r>
         <w:rPr>
@@ -238,12 +215,13 @@
         <w:t xml:space="preserve">• </w:t>
       </w:r>
       <w:r>
-        <w:t>Group safety tools: drift and geofence alerts, group messages, phone ping requests, and notification support.</w:t>
+        <w:t>Offline emergency card with group contact, emergency numbers, trip details, and QR card.</w:t>
       </w:r>
     </w:p>
     <w:p>
       <w:pPr>
-        <w:pStyle w:val="CompactBullet"/>
+        <w:spacing w:after="40"/>
+        <w:ind w:left="259" w:hanging="216"/>
       </w:pPr>
       <w:r>
         <w:rPr>
@@ -252,12 +230,13 @@
         <w:t xml:space="preserve">• </w:t>
       </w:r>
       <w:r>
-        <w:t>Offline emergency card with the pilgrim’s saved trip details, group contact, emergency numbers, and QR card.</w:t>
+        <w:t>Group drift alerts and geofence warnings.</w:t>
       </w:r>
     </w:p>
     <w:p>
       <w:pPr>
-        <w:pStyle w:val="CompactBullet"/>
+        <w:spacing w:after="40"/>
+        <w:ind w:left="259" w:hanging="216"/>
       </w:pPr>
       <w:r>
         <w:rPr>
@@ -266,12 +245,13 @@
         <w:t xml:space="preserve">• </w:t>
       </w:r>
       <w:r>
-        <w:t>Secure QR cards using random revocable tokens instead of predictable personal identifiers.</w:t>
+        <w:t>Group messages, phone ping requests, and notification support.</w:t>
       </w:r>
     </w:p>
     <w:p>
       <w:pPr>
-        <w:pStyle w:val="CompactBullet"/>
+        <w:spacing w:after="40"/>
+        <w:ind w:left="259" w:hanging="216"/>
       </w:pPr>
       <w:r>
         <w:rPr>
@@ -280,12 +260,13 @@
         <w:t xml:space="preserve">• </w:t>
       </w:r>
       <w:r>
-        <w:t>SOS emergency routing by category: medical or heat 997, rescue or fire 998, and lost, security, or general 911.</w:t>
+        <w:t>Secure QR cards using random revocable tokens.</w:t>
       </w:r>
     </w:p>
     <w:p>
       <w:pPr>
-        <w:pStyle w:val="CompactBullet"/>
+        <w:spacing w:after="40"/>
+        <w:ind w:left="259" w:hanging="216"/>
       </w:pPr>
       <w:r>
         <w:rPr>
@@ -294,12 +275,13 @@
         <w:t xml:space="preserve">• </w:t>
       </w:r>
       <w:r>
-        <w:t>A user-confirmed call handoff: the phone opens its call screen, while HajjGuard clearly records that it cannot verify the call was answered.</w:t>
+        <w:t>Category-based emergency numbers: 997 medical or heat, 998 rescue or fire, 911 lost, security, or general.</w:t>
       </w:r>
     </w:p>
     <w:p>
       <w:pPr>
-        <w:pStyle w:val="CompactBullet"/>
+        <w:spacing w:after="40"/>
+        <w:ind w:left="259" w:hanging="216"/>
       </w:pPr>
       <w:r>
         <w:rPr>
@@ -308,12 +290,13 @@
         <w:t xml:space="preserve">• </w:t>
       </w:r>
       <w:r>
-        <w:t>Safety map layers show only source-labelled verified facilities; unverified points are not invented.</w:t>
+        <w:t>User-confirmed manual call link; the system does not call automatically.</w:t>
       </w:r>
     </w:p>
     <w:p>
       <w:pPr>
-        <w:pStyle w:val="CompactBullet"/>
+        <w:spacing w:after="40"/>
+        <w:ind w:left="259" w:hanging="216"/>
       </w:pPr>
       <w:r>
         <w:rPr>
@@ -322,20 +305,13 @@
         <w:t xml:space="preserve">• </w:t>
       </w:r>
       <w:r>
-        <w:t>Clear labels for synthetic, local, or unavailable data so a demonstration is not presented as live field data.</w:t>
+        <w:t>Source-labelled safety map layers; unverified facilities are not shown.</w:t>
       </w:r>
     </w:p>
     <w:p>
       <w:pPr>
-        <w:pStyle w:val="Heading1"/>
-      </w:pPr>
-      <w:r>
-        <w:t>What the app will do in a simple user journey</w:t>
-      </w:r>
-    </w:p>
-    <w:p>
-      <w:pPr>
-        <w:pStyle w:val="CompactBullet"/>
+        <w:spacing w:after="40"/>
+        <w:ind w:left="259" w:hanging="216"/>
       </w:pPr>
       <w:r>
         <w:rPr>
@@ -344,63 +320,7 @@
         <w:t xml:space="preserve">• </w:t>
       </w:r>
       <w:r>
-        <w:t>A pilgrim signs in, joins a group, and sees the map and current zone status.</w:t>
-      </w:r>
-    </w:p>
-    <w:p>
-      <w:pPr>
-        <w:pStyle w:val="CompactBullet"/>
-      </w:pPr>
-      <w:r>
-        <w:rPr>
-          <w:b/>
-        </w:rPr>
-        <w:t xml:space="preserve">• </w:t>
-      </w:r>
-      <w:r>
-        <w:t>The pilgrim can choose to share location for the trip and can stop sharing at any time.</w:t>
-      </w:r>
-    </w:p>
-    <w:p>
-      <w:pPr>
-        <w:pStyle w:val="CompactBullet"/>
-      </w:pPr>
-      <w:r>
-        <w:rPr>
-          <w:b/>
-        </w:rPr>
-        <w:t xml:space="preserve">• </w:t>
-      </w:r>
-      <w:r>
-        <w:t>The pilgrim receives a warning if they drift from the group or approach a configured safety boundary.</w:t>
-      </w:r>
-    </w:p>
-    <w:p>
-      <w:pPr>
-        <w:pStyle w:val="CompactBullet"/>
-      </w:pPr>
-      <w:r>
-        <w:rPr>
-          <w:b/>
-        </w:rPr>
-        <w:t xml:space="preserve">• </w:t>
-      </w:r>
-      <w:r>
-        <w:t>The pilgrim can open the offline card, send an SOS, or manually call the selected emergency number.</w:t>
-      </w:r>
-    </w:p>
-    <w:p>
-      <w:pPr>
-        <w:pStyle w:val="CompactBullet"/>
-      </w:pPr>
-      <w:r>
-        <w:rPr>
-          <w:b/>
-        </w:rPr>
-        <w:t xml:space="preserve">• </w:t>
-      </w:r>
-      <w:r>
-        <w:t>Staff see authorized zones and incidents, review alerts, and maintain records through the operations screens.</w:t>
+        <w:t>Clear labels for local, synthetic, or unavailable data.</w:t>
       </w:r>
     </w:p>
     <w:p>
@@ -408,82 +328,29 @@
         <w:pStyle w:val="Heading1"/>
       </w:pPr>
       <w:r>
-        <w:t>Important project boundaries</w:t>
+        <w:t>Simple project result</w:t>
       </w:r>
     </w:p>
     <w:p>
       <w:pPr>
-        <w:pStyle w:val="CompactBullet"/>
+        <w:spacing w:after="80"/>
       </w:pPr>
       <w:r>
-        <w:rPr>
-          <w:b/>
-        </w:rPr>
-        <w:t xml:space="preserve">• </w:t>
-      </w:r>
-      <w:r>
-        <w:t>The project does not claim official Ministry, Nusuk, Nafath, Civil Defense, SCADA, CCTV, wallet, or emergency-service integration.</w:t>
+        <w:t>HajjGuard will be a web application that helps pilgrims understand crowd conditions, stay connected to their group, find safety information, and request help. Staff will use it to view authorized zones and manage safety incidents.</w:t>
       </w:r>
     </w:p>
     <w:p>
       <w:pPr>
-        <w:pStyle w:val="CompactBullet"/>
+        <w:spacing w:after="0"/>
       </w:pPr>
       <w:r>
-        <w:rPr>
-          <w:b/>
-        </w:rPr>
-        <w:t xml:space="preserve">• </w:t>
-      </w:r>
-      <w:r>
-        <w:t>It does not place emergency calls automatically. It provides a manual call link after user confirmation.</w:t>
-      </w:r>
-    </w:p>
-    <w:p>
-      <w:pPr>
-        <w:pStyle w:val="CompactBullet"/>
-      </w:pPr>
-      <w:r>
-        <w:rPr>
-          <w:b/>
-        </w:rPr>
-        <w:t xml:space="preserve">• </w:t>
-      </w:r>
-      <w:r>
-        <w:t>Crowd, prediction, and route demonstrations use local or synthetic data unless a source is clearly shown.</w:t>
-      </w:r>
-    </w:p>
-    <w:p>
-      <w:pPr>
-        <w:pStyle w:val="CompactBullet"/>
-      </w:pPr>
-      <w:r>
-        <w:rPr>
-          <w:b/>
-        </w:rPr>
-        <w:t xml:space="preserve">• </w:t>
-      </w:r>
-      <w:r>
-        <w:t>The system is an academic safety and decision-support prototype. Field validation and official approval are future work.</w:t>
-      </w:r>
-    </w:p>
-    <w:p>
-      <w:pPr>
-        <w:pStyle w:val="Heading1"/>
-      </w:pPr>
-      <w:r>
-        <w:t>Final message for the presentation</w:t>
-      </w:r>
-    </w:p>
-    <w:p>
-      <w:r>
-        <w:t>HajjGuard brings crowd awareness, group safety, lost-pilgrim recovery, and emergency support into one simple web application. The project follows the doctor’s required baseline and adds stronger privacy, consent, offline access, secure QR recovery, group alerts, and a usable geographic map.</w:t>
+        <w:t>The project does not include automatic emergency calls, official government integrations, or live CCTV feeds.</w:t>
       </w:r>
     </w:p>
     <w:sectPr>
       <w:footerReference w:type="default" r:id="rId9"/>
       <w:pgSz w:w="12240" w:h="15840"/>
-      <w:pgMar w:top="893" w:right="1037" w:bottom="835" w:left="1037" w:header="720" w:footer="720" w:gutter="0"/>
+      <w:pgMar w:top="936" w:right="1080" w:bottom="792" w:left="1080" w:header="720" w:footer="720" w:gutter="0"/>
       <w:cols w:space="720"/>
       <w:docGrid w:linePitch="360"/>
     </w:sectPr>
@@ -503,7 +370,7 @@
         <w:color w:val="646464"/>
         <w:sz w:val="16"/>
       </w:rPr>
-      <w:t>HajjGuard | Project feature summary</w:t>
+      <w:t>HajjGuard | Feature comparison</w:t>
     </w:r>
   </w:p>
 </w:ftr>
@@ -873,11 +740,10 @@
     <w:qFormat/>
     <w:rsid w:val="00FC693F"/>
     <w:pPr>
-      <w:spacing w:after="80" w:line="259" w:lineRule="auto"/>
+      <w:spacing w:after="60"/>
     </w:pPr>
     <w:rPr>
       <w:rFonts w:ascii="Aptos" w:hAnsi="Aptos" w:eastAsia="Aptos"/>
-      <w:color w:val="000000"/>
       <w:sz w:val="21"/>
     </w:rPr>
   </w:style>
@@ -936,7 +802,7 @@
     <w:pPr>
       <w:keepNext/>
       <w:keepLines/>
-      <w:spacing w:before="160" w:after="80"/>
+      <w:spacing w:before="140" w:after="80"/>
       <w:outlineLvl w:val="0"/>
     </w:pPr>
     <w:rPr>
@@ -960,15 +826,15 @@
     <w:pPr>
       <w:keepNext/>
       <w:keepLines/>
-      <w:spacing w:before="160" w:after="80"/>
+      <w:spacing w:before="200" w:after="0"/>
       <w:outlineLvl w:val="1"/>
     </w:pPr>
     <w:rPr>
-      <w:rFonts w:asciiTheme="majorHAnsi" w:eastAsiaTheme="majorEastAsia" w:hAnsiTheme="majorHAnsi" w:cstheme="majorBidi" w:ascii="Aptos Display" w:hAnsi="Aptos Display" w:eastAsia="Aptos Display"/>
+      <w:rFonts w:asciiTheme="majorHAnsi" w:eastAsiaTheme="majorEastAsia" w:hAnsiTheme="majorHAnsi" w:cstheme="majorBidi"/>
       <w:b/>
       <w:bCs/>
-      <w:color w:val="000000"/>
-      <w:sz w:val="23"/>
+      <w:color w:val="4F81BD" w:themeColor="accent1"/>
+      <w:sz w:val="26"/>
       <w:szCs w:val="26"/>
     </w:rPr>
   </w:style>
@@ -1225,7 +1091,7 @@
       <w:pBdr>
         <w:bottom w:val="single" w:sz="8" w:space="4" w:color="4F81BD" w:themeColor="accent1"/>
       </w:pBdr>
-      <w:spacing w:after="80" w:line="240" w:lineRule="auto" w:before="160"/>
+      <w:spacing w:after="80" w:line="240" w:lineRule="auto" w:before="140"/>
       <w:contextualSpacing/>
     </w:pPr>
     <w:rPr>
@@ -12563,14 +12429,6 @@
         <w:shd w:val="clear" w:color="auto" w:fill="FBCAA2" w:themeFill="accent6" w:themeFillTint="7F"/>
       </w:tcPr>
     </w:tblStylePr>
-  </w:style>
-  <w:style w:type="paragraph" w:customStyle="1" w:styleId="CompactBullet">
-    <w:name w:val="Compact Bullet"/>
-    <w:basedOn w:val="Normal"/>
-    <w:pPr>
-      <w:spacing w:after="40" w:line="247" w:lineRule="auto"/>
-      <w:ind w:left="288" w:hanging="230"/>
-    </w:pPr>
   </w:style>
 </w:styles>
 </file>

</xml_diff>